<commit_message>
Refactor POS application from "Librería y Papelería Escolar" to "Tienda Bugambilias"
- Updated database schema and seed data in pos_tienda.sql
- Modified docker-compose configuration to use pos_tienda database
- Adjusted migration script to load pos_tienda.sql
- Changed virtual host configuration to reflect new project name
- Revised documentation to replace references to "Librería" with "Tienda Bugambilias"
- Updated frontend application to reflect new branding and descriptions
- Adjusted test cases to use new email addresses for authentication
</commit_message>
<xml_diff>
--- a/Formato_Casos_Prueba_POS_Web.docx
+++ b/Formato_Casos_Prueba_POS_Web.docx
@@ -27,7 +27,7 @@
           <w:i/>
           <w:iCs/>
         </w:rPr>
-        <w:t>Módulo: Autenticación (Login y Registro) — Proyecto: Sistema POS Web — Tienda El Estudiante (pos_libreria)</w:t>
+        <w:t>Módulo: Autenticación (Login y Registro) — Proyecto: Sistema POS Web — Tienda Bugambilias (pos_tienda)</w:t>
       </w:r>
     </w:p>
     <w:p>
@@ -308,7 +308,7 @@
           </w:tcPr>
           <w:p>
             <w:r>
-              <w:t>correo: admin@libreria.com</w:t>
+              <w:t>correo: admin@tienda.com</w:t>
             </w:r>
           </w:p>
           <w:p>
@@ -730,7 +730,7 @@
           </w:tcPr>
           <w:p>
             <w:r>
-              <w:t>correo: admin@libreria.com</w:t>
+              <w:t>correo: admin@tienda.com</w:t>
             </w:r>
           </w:p>
           <w:p>
@@ -1581,7 +1581,7 @@
           </w:p>
           <w:p>
             <w:r>
-              <w:t>correo: cajero_nuevo@libreria.com</w:t>
+              <w:t>correo: cajero_nuevo@tienda.com</w:t>
             </w:r>
           </w:p>
           <w:p>
@@ -2008,7 +2008,7 @@
           </w:p>
           <w:p>
             <w:r>
-              <w:t>correo: admin@libreria.com  (ya registrado)</w:t>
+              <w:t>correo: admin@tienda.com  (ya registrado)</w:t>
             </w:r>
           </w:p>
           <w:p>

</xml_diff>